<commit_message>
Atualiza qualificação, CEP e data das procurações e declarações
Sérgio: solteiro, recolhido no sistema penal, sem RG, CEP 64.222-000.
Thaiane: CEP 62.400-000. Data de 18/10/2026 em todos os documentos.

Co-Authored-By: Claude Opus 5.5 <noreply@anthropic.com>
Claude-Session: https://claude.ai/code/session_01VpzYZjXHFn3QHNVisLQJ7B
</commit_message>
<xml_diff>
--- a/Sérgio Alves Pereira/Declaração de hipossuficiência - Sérgio Alves Pereira.docx
+++ b/Sérgio Alves Pereira/Declaração de hipossuficiência - Sérgio Alves Pereira.docx
@@ -32,37 +32,7 @@
         <w:t xml:space="preserve">, brasileiro, </w:t>
       </w:r>
       <w:r>
-        <w:rPr>
-          <w:shd w:fill="FFF200" w:color="auto" w:val="clear"/>
-        </w:rPr>
-        <w:t xml:space="preserve">[estado civil]</w:t>
-      </w:r>
-      <w:r>
-        <w:t xml:space="preserve">, </w:t>
-      </w:r>
-      <w:r>
-        <w:rPr>
-          <w:shd w:fill="FFF200" w:color="auto" w:val="clear"/>
-        </w:rPr>
-        <w:t xml:space="preserve">[profissão]</w:t>
-      </w:r>
-      <w:r>
-        <w:t xml:space="preserve">, natural de Teresina/PI, nascido em 10/04/1989, filho de Maria Francisca Ferreira Pontes, portador do RG nº </w:t>
-      </w:r>
-      <w:r>
-        <w:rPr>
-          <w:shd w:fill="FFF200" w:color="auto" w:val="clear"/>
-        </w:rPr>
-        <w:t xml:space="preserve">[nº/órgão expedidor]</w:t>
-      </w:r>
-      <w:r>
-        <w:t xml:space="preserve">, inscrito no CPF sob o nº 613.882.673-65, residente e domiciliado na Rua Sossego, nº 415, Centro, Cajueiro da Praia/PI, CEP </w:t>
-      </w:r>
-      <w:r>
-        <w:rPr>
-          <w:shd w:fill="FFF200" w:color="auto" w:val="clear"/>
-        </w:rPr>
-        <w:t xml:space="preserve">[CEP]</w:t>
+        <w:t xml:space="preserve">solteiro, atualmente recolhido no sistema penal, natural de Teresina/PI, nascido em 10/04/1989, filho de Maria Francisca Ferreira Pontes, inscrito no CPF sob o nº 613.882.673-65, residente e domiciliado na Rua Sossego, nº 415, Centro, Cajueiro da Praia/PI, CEP 64.222-000</w:t>
       </w:r>
       <w:r>
         <w:t xml:space="preserve">, </w:t>
@@ -114,7 +84,7 @@
         <w:jc w:val="center"/>
       </w:pPr>
       <w:r>
-        <w:t xml:space="preserve">Cajueiro da Praia-PI, ____ de ____________________ de 2026.</w:t>
+        <w:t xml:space="preserve">Cajueiro da Praia-PI, 18 de outubro de 2026.</w:t>
       </w:r>
     </w:p>
     <w:p>

</xml_diff>